<commit_message>
docs: update live production website link to neuro-label-ai.vercel.app in README and project report
</commit_message>
<xml_diff>
--- a/NeuroLabel_AI_Project_Report.docx
+++ b/NeuroLabel_AI_Project_Report.docx
@@ -70,6 +70,68 @@
                 <w:sz w:val="20"/>
               </w:rPr>
               <w:t>NeuroLabel AI</w:t>
+            </w:r>
+          </w:p>
+        </w:tc>
+      </w:tr>
+      <w:tr>
+        <w:tc>
+          <w:tcPr>
+            <w:tcW w:type="dxa" w:w="4680"/>
+            <w:shd w:fill="F1F5F9"/>
+          </w:tcPr>
+          <w:p>
+            <w:r>
+              <w:rPr>
+                <w:b/>
+                <w:sz w:val="20"/>
+              </w:rPr>
+              <w:t>Live Production Website</w:t>
+            </w:r>
+          </w:p>
+        </w:tc>
+        <w:tc>
+          <w:tcPr>
+            <w:tcW w:type="dxa" w:w="4680"/>
+            <w:shd w:fill="FFFFFF"/>
+          </w:tcPr>
+          <w:p>
+            <w:r>
+              <w:rPr>
+                <w:sz w:val="20"/>
+              </w:rPr>
+              <w:t>https://neuro-label-ai.vercel.app/</w:t>
+            </w:r>
+          </w:p>
+        </w:tc>
+      </w:tr>
+      <w:tr>
+        <w:tc>
+          <w:tcPr>
+            <w:tcW w:type="dxa" w:w="4680"/>
+            <w:shd w:fill="F1F5F9"/>
+          </w:tcPr>
+          <w:p>
+            <w:r>
+              <w:rPr>
+                <w:b/>
+                <w:sz w:val="20"/>
+              </w:rPr>
+              <w:t>GitHub Repository</w:t>
+            </w:r>
+          </w:p>
+        </w:tc>
+        <w:tc>
+          <w:tcPr>
+            <w:tcW w:type="dxa" w:w="4680"/>
+            <w:shd w:fill="FFFFFF"/>
+          </w:tcPr>
+          <w:p>
+            <w:r>
+              <w:rPr>
+                <w:sz w:val="20"/>
+              </w:rPr>
+              <w:t>https://github.com/panchaksharayya12/NeuroLabel-AI</w:t>
             </w:r>
           </w:p>
         </w:tc>
@@ -1205,7 +1267,14 @@
     </w:p>
     <w:p>
       <w:r>
-        <w:t>1. Backend Startup:</w:t>
+        <w:t>1. Live Production Deployment:</w:t>
+        <w:br/>
+        <w:t xml:space="preserve">   Website: https://neuro-label-ai.vercel.app/</w:t>
+        <w:br/>
+        <w:t xml:space="preserve">   GitHub Repository: https://github.com/panchaksharayya12/NeuroLabel-AI</w:t>
+        <w:br/>
+        <w:br/>
+        <w:t>2. Backend Local Startup:</w:t>
         <w:br/>
         <w:t xml:space="preserve">   cd backend</w:t>
         <w:br/>
@@ -1214,16 +1283,16 @@
         <w:t xml:space="preserve">   python -m uvicorn app.main:app --host 127.0.0.1 --port 8000 --reload</w:t>
         <w:br/>
         <w:br/>
-        <w:t>2. Frontend Startup:</w:t>
+        <w:t>3. Frontend Local Startup:</w:t>
         <w:br/>
         <w:t xml:space="preserve">   cd frontend</w:t>
         <w:br/>
         <w:t xml:space="preserve">   npm run dev</w:t>
         <w:br/>
         <w:br/>
-        <w:t>3. Web Access:</w:t>
+        <w:t>4. Local Access:</w:t>
         <w:br/>
-        <w:t xml:space="preserve">   Frontend: http://localhost:5173</w:t>
+        <w:t xml:space="preserve">   Frontend Server: http://localhost:5173</w:t>
         <w:br/>
         <w:t xml:space="preserve">   Backend Docs: http://localhost:8000/docs</w:t>
       </w:r>

</xml_diff>